<commit_message>
Nuevas actividades plastica y lengua
</commit_message>
<xml_diff>
--- a/Melany - IAFO/PLASTICA/PLASTICA - Melany Abril 2026.docx
+++ b/Melany - IAFO/PLASTICA/PLASTICA - Melany Abril 2026.docx
@@ -81,35 +81,23 @@
       </w:r>
       <w:r>
         <w:lastRenderedPageBreak/>
-        <w:t>PUEDE SER COMPRENDIDA COMO LA FILOSOFÍA DE LA PERCEPCIÓN EN GENERAL.</w:t>
-      </w:r>
-    </w:p>
-    <w:p>
-      <w:pPr>
-        <w:spacing w:line="278" w:lineRule="auto"/>
-        <w:jc w:val="left"/>
-      </w:pPr>
-      <w:r>
-        <w:br w:type="page"/>
-      </w:r>
-    </w:p>
-    <w:p>
+        <w:t xml:space="preserve">PUEDE SER COMPRENDIDA COMO LA </w:t>
+      </w:r>
       <w:r>
         <w:rPr>
           <w:noProof/>
         </w:rPr>
-        <w:lastRenderedPageBreak/>
         <w:drawing>
-          <wp:anchor distT="0" distB="0" distL="114300" distR="114300" simplePos="0" relativeHeight="251658240" behindDoc="0" locked="0" layoutInCell="1" allowOverlap="1" wp14:anchorId="788765A5" wp14:editId="077E8C2E">
+          <wp:anchor distT="0" distB="0" distL="114300" distR="114300" simplePos="0" relativeHeight="251658240" behindDoc="0" locked="0" layoutInCell="1" allowOverlap="1" wp14:anchorId="788765A5" wp14:editId="6A3AD02E">
             <wp:simplePos x="0" y="0"/>
             <wp:positionH relativeFrom="margin">
               <wp:align>right</wp:align>
             </wp:positionH>
             <wp:positionV relativeFrom="paragraph">
-              <wp:posOffset>0</wp:posOffset>
+              <wp:posOffset>1016000</wp:posOffset>
             </wp:positionV>
-            <wp:extent cx="6858000" cy="11871960"/>
-            <wp:effectExtent l="0" t="0" r="0" b="0"/>
+            <wp:extent cx="6832600" cy="10860405"/>
+            <wp:effectExtent l="0" t="0" r="6350" b="0"/>
             <wp:wrapSquare wrapText="bothSides"/>
             <wp:docPr id="1686479764" name="Imagen 2"/>
             <wp:cNvGraphicFramePr>
@@ -125,7 +113,7 @@
                     </pic:cNvPicPr>
                   </pic:nvPicPr>
                   <pic:blipFill>
-                    <a:blip r:embed="rId4">
+                    <a:blip r:embed="rId5">
                       <a:extLst>
                         <a:ext uri="{28A0092B-C50C-407E-A947-70E740481C1C}">
                           <a14:useLocalDpi xmlns:a14="http://schemas.microsoft.com/office/drawing/2010/main" val="0"/>
@@ -140,7 +128,7 @@
                   <pic:spPr bwMode="auto">
                     <a:xfrm>
                       <a:off x="0" y="0"/>
-                      <a:ext cx="6858000" cy="11871960"/>
+                      <a:ext cx="6832600" cy="10860405"/>
                     </a:xfrm>
                     <a:prstGeom prst="rect">
                       <a:avLst/>
@@ -159,15 +147,22 @@
           </wp:anchor>
         </w:drawing>
       </w:r>
+      <w:r>
+        <w:t>FILOSOFÍA DE LA PERCEPCIÓN EN GENERAL.</w:t>
+      </w:r>
     </w:p>
     <w:p>
+      <w:pPr>
+        <w:spacing w:line="278" w:lineRule="auto"/>
+        <w:jc w:val="left"/>
+      </w:pPr>
       <w:r>
         <w:rPr>
           <w:noProof/>
         </w:rPr>
         <w:lastRenderedPageBreak/>
         <w:drawing>
-          <wp:anchor distT="0" distB="0" distL="114300" distR="114300" simplePos="0" relativeHeight="251659264" behindDoc="0" locked="0" layoutInCell="1" allowOverlap="1" wp14:anchorId="797E0E2C" wp14:editId="7712CEE6">
+          <wp:anchor distT="0" distB="0" distL="114300" distR="114300" simplePos="0" relativeHeight="251659264" behindDoc="0" locked="0" layoutInCell="1" allowOverlap="1" wp14:anchorId="797E0E2C" wp14:editId="4D7CE447">
             <wp:simplePos x="0" y="0"/>
             <wp:positionH relativeFrom="margin">
               <wp:align>right</wp:align>
@@ -175,7 +170,7 @@
             <wp:positionV relativeFrom="paragraph">
               <wp:posOffset>0</wp:posOffset>
             </wp:positionV>
-            <wp:extent cx="6842760" cy="11871960"/>
+            <wp:extent cx="6842760" cy="11506200"/>
             <wp:effectExtent l="0" t="0" r="0" b="0"/>
             <wp:wrapSquare wrapText="bothSides"/>
             <wp:docPr id="969597366" name="Imagen 4"/>
@@ -192,7 +187,7 @@
                     </pic:cNvPicPr>
                   </pic:nvPicPr>
                   <pic:blipFill rotWithShape="1">
-                    <a:blip r:embed="rId5">
+                    <a:blip r:embed="rId6">
                       <a:extLst>
                         <a:ext uri="{28A0092B-C50C-407E-A947-70E740481C1C}">
                           <a14:useLocalDpi xmlns:a14="http://schemas.microsoft.com/office/drawing/2010/main" val="0"/>
@@ -207,7 +202,7 @@
                   <pic:spPr bwMode="auto">
                     <a:xfrm>
                       <a:off x="0" y="0"/>
-                      <a:ext cx="6842760" cy="11871960"/>
+                      <a:ext cx="6842760" cy="11506200"/>
                     </a:xfrm>
                     <a:prstGeom prst="rect">
                       <a:avLst/>
@@ -234,34 +229,12 @@
           </wp:anchor>
         </w:drawing>
       </w:r>
-      <w:r>
-        <w:br w:type="page"/>
-      </w:r>
     </w:p>
-    <w:p>
-      <w:r>
-        <w:lastRenderedPageBreak/>
-        <w:br w:type="page"/>
-      </w:r>
-    </w:p>
-    <w:p>
-      <w:r>
-        <w:lastRenderedPageBreak/>
-        <w:br w:type="page"/>
-      </w:r>
-    </w:p>
-    <w:p>
-      <w:r>
-        <w:lastRenderedPageBreak/>
-        <w:br w:type="page"/>
-      </w:r>
-    </w:p>
-    <w:p/>
     <w:sectPr>
       <w:pgSz w:w="12240" w:h="20160" w:code="5"/>
       <w:pgMar w:top="720" w:right="720" w:bottom="720" w:left="720" w:header="708" w:footer="708" w:gutter="0"/>
       <w:cols w:space="708"/>
-      <w:docGrid w:linePitch="360"/>
+      <w:docGrid w:linePitch="653"/>
     </w:sectPr>
   </w:body>
 </w:document>
@@ -879,6 +852,7 @@
   <w:style w:type="character" w:default="1" w:styleId="Fuentedeprrafopredeter">
     <w:name w:val="Default Paragraph Font"/>
     <w:uiPriority w:val="1"/>
+    <w:semiHidden/>
     <w:unhideWhenUsed/>
   </w:style>
   <w:style w:type="table" w:default="1" w:styleId="Tablanormal">
@@ -1508,4 +1482,16 @@
     </a:ext>
   </a:extLst>
 </a:theme>
+</file>
+
+<file path=customXml/item1.xml><?xml version="1.0" encoding="utf-8"?>
+<b:Sources xmlns:b="http://schemas.openxmlformats.org/officeDocument/2006/bibliography" xmlns="http://schemas.openxmlformats.org/officeDocument/2006/bibliography" SelectedStyle="\APASixthEditionOfficeOnline.xsl" StyleName="APA" Version="6"/>
+</file>
+
+<file path=customXml/itemProps1.xml><?xml version="1.0" encoding="utf-8"?>
+<ds:datastoreItem xmlns:ds="http://schemas.openxmlformats.org/officeDocument/2006/customXml" ds:itemID="{1AF0E7CA-D4D5-4F1F-87AC-567BDA29538B}">
+  <ds:schemaRefs>
+    <ds:schemaRef ds:uri="http://schemas.openxmlformats.org/officeDocument/2006/bibliography"/>
+  </ds:schemaRefs>
+</ds:datastoreItem>
 </file>
</xml_diff>